<commit_message>
Apply compliance review fixes to KDP metadata
Co-Authored-By: Claude Sonnet 5.5 <noreply@anthropic.com>
Claude-Session: https://claude.ai/code/session_0168JnD9FtTqg34DkRs7Q2We
</commit_message>
<xml_diff>
--- a/books/emergency-medicine/final/KDP-metadata.docx
+++ b/books/emergency-medicine/final/KDP-metadata.docx
@@ -534,7 +534,7 @@
         <w:pStyle w:val="FirstParagraph"/>
       </w:pPr>
       <w:r>
-        <w:t xml:space="preserve">A 179-page, 5 x 8 inch, full-color illustrated study guide in six Parts and 45 numbered entries: the emergency approach (safety, triage, surveys, vital signs, communication); airway and breathing; cardiac emergencies and resuscitation; trauma, burns and environmental emergencies; medical emergencies; and special populations and safety. It has 25 figures, procedure boxes, Safety, Red Flags, Scope Note, Remember and Care Priorities boxes, a fictional illustrative case and eight review questions per Part, a 68-term glossary and an index. It is written for United States practice, gives no medicine doses, and says plainly that it does not replace training or local protocol. The text and images were created with AI tools (disclosed on the copyright page).</w:t>
+        <w:t xml:space="preserve">A 179-page, 5 x 8 inch, full-color illustrated study guide in six Parts and 33 numbered entries: the emergency approach (safety, triage, surveys, vital signs, communication); airway and breathing; cardiac emergencies and resuscitation; trauma, burns and environmental emergencies; medical emergencies; and special populations and safety. It has 25 figures, procedure boxes, Safety, Red Flags, Scope Note, Remember and Care Priorities boxes, a fictional illustrative case and eight review questions per Part, a 68-term glossary and an index. It is written for United States practice, gives no medicine doses, and says plainly that it does not replace training or local protocol. The text and images were created with AI tools (disclosed on the copyright page).</w:t>
       </w:r>
     </w:p>
     <w:bookmarkEnd w:id="22"/>
@@ -628,7 +628,7 @@
           <w:iCs/>
           <w:i/>
         </w:rPr>
-        <w:t xml:space="preserve">385 words.</w:t>
+        <w:t xml:space="preserve">363 words.</w:t>
       </w:r>
     </w:p>
     <w:p>
@@ -680,7 +680,7 @@
         <w:pStyle w:val="Compact"/>
       </w:pPr>
       <w:r>
-        <w:t xml:space="preserve">Six Parts and 45 numbered entries, so you can find a topic fast</w:t>
+        <w:t xml:space="preserve">Six Parts and 33 numbered entries, so you can find a topic fast</w:t>
       </w:r>
     </w:p>
     <w:p>
@@ -748,7 +748,7 @@
         <w:pStyle w:val="BodyText"/>
       </w:pPr>
       <w:r>
-        <w:t xml:space="preserve">Scene safety, triage and acuity, the primary and secondary survey, airway and breathing emergencies, bag-valve-mask ventilation, anaphylaxis, chest pain and the heart, CPR and the AED, shock, bleeding control, burns, fractures, stroke, seizures, sepsis, poisoning, children, pregnancy, older adults and behavioral emergencies.</w:t>
+        <w:t xml:space="preserve">The guide moves from scene safety, triage and the primary and secondary survey to airway and breathing emergencies, the heart and resuscitation, injury and burns, medical emergencies such as stroke, seizure and sepsis, and the special needs of children, pregnant patients and older adults.</w:t>
       </w:r>
     </w:p>
     <w:p>
@@ -760,7 +760,15 @@
           <w:bCs/>
           <w:b/>
         </w:rPr>
-        <w:t xml:space="preserve">Who it is for</w:t>
+        <w:t xml:space="preserve">Why the order matters</w:t>
+      </w:r>
+    </w:p>
+    <w:p>
+      <w:pPr>
+        <w:pStyle w:val="BodyText"/>
+      </w:pPr>
+      <w:r>
+        <w:t xml:space="preserve">Each entry in this guide gives the reason behind its steps, so you understand why a scene check comes before everything, why the primary survey runs in a fixed order, and why a patient who looks well can still be sick. Knowing the reason makes the sequence easier to remember.</w:t>
       </w:r>
     </w:p>
     <w:p>
@@ -772,15 +780,7 @@
           <w:bCs/>
           <w:b/>
         </w:rPr>
-        <w:t xml:space="preserve">Why the order matters</w:t>
-      </w:r>
-    </w:p>
-    <w:p>
-      <w:pPr>
-        <w:pStyle w:val="BodyText"/>
-      </w:pPr>
-      <w:r>
-        <w:t xml:space="preserve">Most mistakes in the first minutes of an emergency come from skipping a step, not from missing a rare fact. Each entry in this guide gives the reason behind its steps, so you understand why airway comes before circulation, why a scene check comes before everything, and why a patient who looks well can still be sick. Understanding the reason helps you remember the sequence and adapt when a real patient does not match the picture in your mind.</w:t>
+        <w:t xml:space="preserve">Who it is for</w:t>
       </w:r>
     </w:p>
     <w:p>
@@ -818,7 +818,7 @@
           <w:iCs/>
           <w:i/>
         </w:rPr>
-        <w:t xml:space="preserve">2415 characters including tags (limit 4,000).</w:t>
+        <w:t xml:space="preserve">2209 characters including tags (limit 4,000).</w:t>
       </w:r>
     </w:p>
     <w:p>
@@ -1039,7 +1039,7 @@
         <w:rPr>
           <w:rStyle w:val="NormalTok"/>
         </w:rPr>
-        <w:t xml:space="preserve">Six Parts and 45 numbered entries, so you can find a topic fast</w:t>
+        <w:t xml:space="preserve">Six Parts and 33 numbered entries, so you can find a topic fast</w:t>
       </w:r>
       <w:r>
         <w:rPr>
@@ -1267,7 +1267,7 @@
         <w:rPr>
           <w:rStyle w:val="NormalTok"/>
         </w:rPr>
-        <w:t xml:space="preserve">Scene safety, triage and acuity, the primary and secondary survey, airway and breathing emergencies, bag-valve-mask ventilation, anaphylaxis, chest pain and the heart, CPR and the AED, shock, bleeding control, burns, fractures, stroke, seizures, sepsis, poisoning, children, pregnancy, older adults and behavioral emergencies.</w:t>
+        <w:t xml:space="preserve">The guide moves from scene safety, triage and the primary and secondary survey to airway and breathing emergencies, the heart and resuscitation, injury and burns, medical emergencies such as stroke, seizure and sepsis, and the special needs of children, pregnant patients and older adults.</w:t>
       </w:r>
       <w:r>
         <w:rPr>
@@ -1303,6 +1303,78 @@
         <w:rPr>
           <w:rStyle w:val="NormalTok"/>
         </w:rPr>
+        <w:t xml:space="preserve">Why the order matters</w:t>
+      </w:r>
+      <w:r>
+        <w:rPr>
+          <w:rStyle w:val="DataTypeTok"/>
+        </w:rPr>
+        <w:t xml:space="preserve">&lt;/</w:t>
+      </w:r>
+      <w:r>
+        <w:rPr>
+          <w:rStyle w:val="KeywordTok"/>
+        </w:rPr>
+        <w:t xml:space="preserve">h5</w:t>
+      </w:r>
+      <w:r>
+        <w:rPr>
+          <w:rStyle w:val="DataTypeTok"/>
+        </w:rPr>
+        <w:t xml:space="preserve">&gt;&lt;</w:t>
+      </w:r>
+      <w:r>
+        <w:rPr>
+          <w:rStyle w:val="KeywordTok"/>
+        </w:rPr>
+        <w:t xml:space="preserve">p</w:t>
+      </w:r>
+      <w:r>
+        <w:rPr>
+          <w:rStyle w:val="DataTypeTok"/>
+        </w:rPr>
+        <w:t xml:space="preserve">&gt;</w:t>
+      </w:r>
+      <w:r>
+        <w:rPr>
+          <w:rStyle w:val="NormalTok"/>
+        </w:rPr>
+        <w:t xml:space="preserve">Each entry in this guide gives the reason behind its steps, so you understand why a scene check comes before everything, why the primary survey runs in a fixed order, and why a patient who looks well can still be sick. Knowing the reason makes the sequence easier to remember.</w:t>
+      </w:r>
+      <w:r>
+        <w:rPr>
+          <w:rStyle w:val="DataTypeTok"/>
+        </w:rPr>
+        <w:t xml:space="preserve">&lt;/</w:t>
+      </w:r>
+      <w:r>
+        <w:rPr>
+          <w:rStyle w:val="KeywordTok"/>
+        </w:rPr>
+        <w:t xml:space="preserve">p</w:t>
+      </w:r>
+      <w:r>
+        <w:rPr>
+          <w:rStyle w:val="DataTypeTok"/>
+        </w:rPr>
+        <w:t xml:space="preserve">&gt;&lt;</w:t>
+      </w:r>
+      <w:r>
+        <w:rPr>
+          <w:rStyle w:val="KeywordTok"/>
+        </w:rPr>
+        <w:t xml:space="preserve">h5</w:t>
+      </w:r>
+      <w:r>
+        <w:rPr>
+          <w:rStyle w:val="DataTypeTok"/>
+        </w:rPr>
+        <w:t xml:space="preserve">&gt;</w:t>
+      </w:r>
+      <w:r>
+        <w:rPr>
+          <w:rStyle w:val="NormalTok"/>
+        </w:rPr>
         <w:t xml:space="preserve">Who it is for</w:t>
       </w:r>
       <w:r>
@@ -1316,78 +1388,6 @@
           <w:rStyle w:val="KeywordTok"/>
         </w:rPr>
         <w:t xml:space="preserve">h5</w:t>
-      </w:r>
-      <w:r>
-        <w:rPr>
-          <w:rStyle w:val="DataTypeTok"/>
-        </w:rPr>
-        <w:t xml:space="preserve">&gt;&lt;</w:t>
-      </w:r>
-      <w:r>
-        <w:rPr>
-          <w:rStyle w:val="KeywordTok"/>
-        </w:rPr>
-        <w:t xml:space="preserve">h5</w:t>
-      </w:r>
-      <w:r>
-        <w:rPr>
-          <w:rStyle w:val="DataTypeTok"/>
-        </w:rPr>
-        <w:t xml:space="preserve">&gt;</w:t>
-      </w:r>
-      <w:r>
-        <w:rPr>
-          <w:rStyle w:val="NormalTok"/>
-        </w:rPr>
-        <w:t xml:space="preserve">Why the order matters</w:t>
-      </w:r>
-      <w:r>
-        <w:rPr>
-          <w:rStyle w:val="DataTypeTok"/>
-        </w:rPr>
-        <w:t xml:space="preserve">&lt;/</w:t>
-      </w:r>
-      <w:r>
-        <w:rPr>
-          <w:rStyle w:val="KeywordTok"/>
-        </w:rPr>
-        <w:t xml:space="preserve">h5</w:t>
-      </w:r>
-      <w:r>
-        <w:rPr>
-          <w:rStyle w:val="DataTypeTok"/>
-        </w:rPr>
-        <w:t xml:space="preserve">&gt;&lt;</w:t>
-      </w:r>
-      <w:r>
-        <w:rPr>
-          <w:rStyle w:val="KeywordTok"/>
-        </w:rPr>
-        <w:t xml:space="preserve">p</w:t>
-      </w:r>
-      <w:r>
-        <w:rPr>
-          <w:rStyle w:val="DataTypeTok"/>
-        </w:rPr>
-        <w:t xml:space="preserve">&gt;</w:t>
-      </w:r>
-      <w:r>
-        <w:rPr>
-          <w:rStyle w:val="NormalTok"/>
-        </w:rPr>
-        <w:t xml:space="preserve">Most mistakes in the first minutes of an emergency come from skipping a step, not from missing a rare fact. Each entry in this guide gives the reason behind its steps, so you understand why airway comes before circulation, why a scene check comes before everything, and why a patient who looks well can still be sick. Understanding the reason helps you remember the sequence and adapt when a real patient does not match the picture in your mind.</w:t>
-      </w:r>
-      <w:r>
-        <w:rPr>
-          <w:rStyle w:val="DataTypeTok"/>
-        </w:rPr>
-        <w:t xml:space="preserve">&lt;/</w:t>
-      </w:r>
-      <w:r>
-        <w:rPr>
-          <w:rStyle w:val="KeywordTok"/>
-        </w:rPr>
-        <w:t xml:space="preserve">p</w:t>
       </w:r>
       <w:r>
         <w:rPr>
@@ -1511,7 +1511,7 @@
           <w:iCs/>
           <w:i/>
         </w:rPr>
-        <w:t xml:space="preserve">377 words.</w:t>
+        <w:t xml:space="preserve">380 words.</w:t>
       </w:r>
     </w:p>
     <w:p>
@@ -1659,7 +1659,23 @@
           <w:bCs/>
           <w:b/>
         </w:rPr>
-        <w:t xml:space="preserve">Who should read it</w:t>
+        <w:t xml:space="preserve">Clear limits, honest scope</w:t>
+      </w:r>
+    </w:p>
+    <w:p>
+      <w:pPr>
+        <w:pStyle w:val="BodyText"/>
+      </w:pPr>
+      <w:r>
+        <w:t xml:space="preserve">What you may do depends on your license, certification, course and the rules of your service or school. Scope Note boxes mark the limits of your role, and procedures tell you when to stop and when to call for more help. Practical advice is paired with plain statements of what the book does not cover, such as medicine amounts, intravenous access, detailed heart tracing interpretation and advanced airway skills, so you always know where this guide ends and your training begins.</w:t>
+      </w:r>
+    </w:p>
+    <w:p>
+      <w:pPr>
+        <w:pStyle w:val="BodyText"/>
+      </w:pPr>
+      <w:r>
+        <w:t xml:space="preserve">Illustrative cases are fictional and written for teaching. Each one walks through a realistic situation from the first look at the scene to the handover, so you can see the priorities applied in order and compare your own thinking with the steps shown.</w:t>
       </w:r>
     </w:p>
     <w:p>
@@ -1671,23 +1687,7 @@
           <w:bCs/>
           <w:b/>
         </w:rPr>
-        <w:t xml:space="preserve">Clear limits, honest scope</w:t>
-      </w:r>
-    </w:p>
-    <w:p>
-      <w:pPr>
-        <w:pStyle w:val="BodyText"/>
-      </w:pPr>
-      <w:r>
-        <w:t xml:space="preserve">What you may do depends on your license, certification, course and the rules of your service or school. Every procedure in this guide says so, tells you when to stop, and tells you when to call for more help. Practical advice is paired with plain statements of what the book does not cover, such as medicine amounts, intravenous access, reading heart tracings and advanced airway skills, so you always know where this guide ends and your training begins.</w:t>
-      </w:r>
-    </w:p>
-    <w:p>
-      <w:pPr>
-        <w:pStyle w:val="BodyText"/>
-      </w:pPr>
-      <w:r>
-        <w:t xml:space="preserve">Illustrative cases are fictional and written for teaching. Each one walks through a realistic situation from the first look at the scene to the handover, so you can see the priorities applied in order and compare your own thinking with the steps shown.</w:t>
+        <w:t xml:space="preserve">Who should read it</w:t>
       </w:r>
     </w:p>
     <w:p>
@@ -1725,7 +1725,7 @@
           <w:iCs/>
           <w:i/>
         </w:rPr>
-        <w:t xml:space="preserve">2397 characters including tags (limit 4,000).</w:t>
+        <w:t xml:space="preserve">2423 characters including tags (limit 4,000).</w:t>
       </w:r>
     </w:p>
     <w:p>
@@ -2258,6 +2258,114 @@
         <w:rPr>
           <w:rStyle w:val="NormalTok"/>
         </w:rPr>
+        <w:t xml:space="preserve">Clear limits, honest scope</w:t>
+      </w:r>
+      <w:r>
+        <w:rPr>
+          <w:rStyle w:val="DataTypeTok"/>
+        </w:rPr>
+        <w:t xml:space="preserve">&lt;/</w:t>
+      </w:r>
+      <w:r>
+        <w:rPr>
+          <w:rStyle w:val="KeywordTok"/>
+        </w:rPr>
+        <w:t xml:space="preserve">h5</w:t>
+      </w:r>
+      <w:r>
+        <w:rPr>
+          <w:rStyle w:val="DataTypeTok"/>
+        </w:rPr>
+        <w:t xml:space="preserve">&gt;&lt;</w:t>
+      </w:r>
+      <w:r>
+        <w:rPr>
+          <w:rStyle w:val="KeywordTok"/>
+        </w:rPr>
+        <w:t xml:space="preserve">p</w:t>
+      </w:r>
+      <w:r>
+        <w:rPr>
+          <w:rStyle w:val="DataTypeTok"/>
+        </w:rPr>
+        <w:t xml:space="preserve">&gt;</w:t>
+      </w:r>
+      <w:r>
+        <w:rPr>
+          <w:rStyle w:val="NormalTok"/>
+        </w:rPr>
+        <w:t xml:space="preserve">What you may do depends on your license, certification, course and the rules of your service or school. Scope Note boxes mark the limits of your role, and procedures tell you when to stop and when to call for more help. Practical advice is paired with plain statements of what the book does not cover, such as medicine amounts, intravenous access, detailed heart tracing interpretation and advanced airway skills, so you always know where this guide ends and your training begins.</w:t>
+      </w:r>
+      <w:r>
+        <w:rPr>
+          <w:rStyle w:val="DataTypeTok"/>
+        </w:rPr>
+        <w:t xml:space="preserve">&lt;/</w:t>
+      </w:r>
+      <w:r>
+        <w:rPr>
+          <w:rStyle w:val="KeywordTok"/>
+        </w:rPr>
+        <w:t xml:space="preserve">p</w:t>
+      </w:r>
+      <w:r>
+        <w:rPr>
+          <w:rStyle w:val="DataTypeTok"/>
+        </w:rPr>
+        <w:t xml:space="preserve">&gt;&lt;</w:t>
+      </w:r>
+      <w:r>
+        <w:rPr>
+          <w:rStyle w:val="KeywordTok"/>
+        </w:rPr>
+        <w:t xml:space="preserve">p</w:t>
+      </w:r>
+      <w:r>
+        <w:rPr>
+          <w:rStyle w:val="DataTypeTok"/>
+        </w:rPr>
+        <w:t xml:space="preserve">&gt;</w:t>
+      </w:r>
+      <w:r>
+        <w:rPr>
+          <w:rStyle w:val="NormalTok"/>
+        </w:rPr>
+        <w:t xml:space="preserve">Illustrative cases are fictional and written for teaching. Each one walks through a realistic situation from the first look at the scene to the handover, so you can see the priorities applied in order and compare your own thinking with the steps shown.</w:t>
+      </w:r>
+      <w:r>
+        <w:rPr>
+          <w:rStyle w:val="DataTypeTok"/>
+        </w:rPr>
+        <w:t xml:space="preserve">&lt;/</w:t>
+      </w:r>
+      <w:r>
+        <w:rPr>
+          <w:rStyle w:val="KeywordTok"/>
+        </w:rPr>
+        <w:t xml:space="preserve">p</w:t>
+      </w:r>
+      <w:r>
+        <w:rPr>
+          <w:rStyle w:val="DataTypeTok"/>
+        </w:rPr>
+        <w:t xml:space="preserve">&gt;&lt;</w:t>
+      </w:r>
+      <w:r>
+        <w:rPr>
+          <w:rStyle w:val="KeywordTok"/>
+        </w:rPr>
+        <w:t xml:space="preserve">h5</w:t>
+      </w:r>
+      <w:r>
+        <w:rPr>
+          <w:rStyle w:val="DataTypeTok"/>
+        </w:rPr>
+        <w:t xml:space="preserve">&gt;</w:t>
+      </w:r>
+      <w:r>
+        <w:rPr>
+          <w:rStyle w:val="NormalTok"/>
+        </w:rPr>
         <w:t xml:space="preserve">Who should read it</w:t>
       </w:r>
       <w:r>
@@ -2271,114 +2379,6 @@
           <w:rStyle w:val="KeywordTok"/>
         </w:rPr>
         <w:t xml:space="preserve">h5</w:t>
-      </w:r>
-      <w:r>
-        <w:rPr>
-          <w:rStyle w:val="DataTypeTok"/>
-        </w:rPr>
-        <w:t xml:space="preserve">&gt;&lt;</w:t>
-      </w:r>
-      <w:r>
-        <w:rPr>
-          <w:rStyle w:val="KeywordTok"/>
-        </w:rPr>
-        <w:t xml:space="preserve">h5</w:t>
-      </w:r>
-      <w:r>
-        <w:rPr>
-          <w:rStyle w:val="DataTypeTok"/>
-        </w:rPr>
-        <w:t xml:space="preserve">&gt;</w:t>
-      </w:r>
-      <w:r>
-        <w:rPr>
-          <w:rStyle w:val="NormalTok"/>
-        </w:rPr>
-        <w:t xml:space="preserve">Clear limits, honest scope</w:t>
-      </w:r>
-      <w:r>
-        <w:rPr>
-          <w:rStyle w:val="DataTypeTok"/>
-        </w:rPr>
-        <w:t xml:space="preserve">&lt;/</w:t>
-      </w:r>
-      <w:r>
-        <w:rPr>
-          <w:rStyle w:val="KeywordTok"/>
-        </w:rPr>
-        <w:t xml:space="preserve">h5</w:t>
-      </w:r>
-      <w:r>
-        <w:rPr>
-          <w:rStyle w:val="DataTypeTok"/>
-        </w:rPr>
-        <w:t xml:space="preserve">&gt;&lt;</w:t>
-      </w:r>
-      <w:r>
-        <w:rPr>
-          <w:rStyle w:val="KeywordTok"/>
-        </w:rPr>
-        <w:t xml:space="preserve">p</w:t>
-      </w:r>
-      <w:r>
-        <w:rPr>
-          <w:rStyle w:val="DataTypeTok"/>
-        </w:rPr>
-        <w:t xml:space="preserve">&gt;</w:t>
-      </w:r>
-      <w:r>
-        <w:rPr>
-          <w:rStyle w:val="NormalTok"/>
-        </w:rPr>
-        <w:t xml:space="preserve">What you may do depends on your license, certification, course and the rules of your service or school. Every procedure in this guide says so, tells you when to stop, and tells you when to call for more help. Practical advice is paired with plain statements of what the book does not cover, such as medicine amounts, intravenous access, reading heart tracings and advanced airway skills, so you always know where this guide ends and your training begins.</w:t>
-      </w:r>
-      <w:r>
-        <w:rPr>
-          <w:rStyle w:val="DataTypeTok"/>
-        </w:rPr>
-        <w:t xml:space="preserve">&lt;/</w:t>
-      </w:r>
-      <w:r>
-        <w:rPr>
-          <w:rStyle w:val="KeywordTok"/>
-        </w:rPr>
-        <w:t xml:space="preserve">p</w:t>
-      </w:r>
-      <w:r>
-        <w:rPr>
-          <w:rStyle w:val="DataTypeTok"/>
-        </w:rPr>
-        <w:t xml:space="preserve">&gt;&lt;</w:t>
-      </w:r>
-      <w:r>
-        <w:rPr>
-          <w:rStyle w:val="KeywordTok"/>
-        </w:rPr>
-        <w:t xml:space="preserve">p</w:t>
-      </w:r>
-      <w:r>
-        <w:rPr>
-          <w:rStyle w:val="DataTypeTok"/>
-        </w:rPr>
-        <w:t xml:space="preserve">&gt;</w:t>
-      </w:r>
-      <w:r>
-        <w:rPr>
-          <w:rStyle w:val="NormalTok"/>
-        </w:rPr>
-        <w:t xml:space="preserve">Illustrative cases are fictional and written for teaching. Each one walks through a realistic situation from the first look at the scene to the handover, so you can see the priorities applied in order and compare your own thinking with the steps shown.</w:t>
-      </w:r>
-      <w:r>
-        <w:rPr>
-          <w:rStyle w:val="DataTypeTok"/>
-        </w:rPr>
-        <w:t xml:space="preserve">&lt;/</w:t>
-      </w:r>
-      <w:r>
-        <w:rPr>
-          <w:rStyle w:val="KeywordTok"/>
-        </w:rPr>
-        <w:t xml:space="preserve">p</w:t>
       </w:r>
       <w:r>
         <w:rPr>
@@ -2502,7 +2502,7 @@
           <w:iCs/>
           <w:i/>
         </w:rPr>
-        <w:t xml:space="preserve">358 words.</w:t>
+        <w:t xml:space="preserve">363 words.</w:t>
       </w:r>
     </w:p>
     <w:p>
@@ -2534,7 +2534,7 @@
           <w:bCs/>
           <w:b/>
         </w:rPr>
-        <w:t xml:space="preserve">Six Parts, 45 entries</w:t>
+        <w:t xml:space="preserve">Six Parts, 33 entries</w:t>
       </w:r>
     </w:p>
     <w:p>
@@ -2626,7 +2626,7 @@
         <w:pStyle w:val="BodyText"/>
       </w:pPr>
       <w:r>
-        <w:t xml:space="preserve">Twenty-five figures, numbered procedure boxes, illustrative cases, review questions with answers, a 68-term glossary and an index make the content easy to revisit. Procedures state their scope, and the book tells you to follow your local protocol whenever it differs.</w:t>
+        <w:t xml:space="preserve">Twenty-five figures, numbered procedure boxes, illustrative cases, review questions with answers, a 68-term glossary and an index make the content easy to revisit. Scope Note boxes mark the limits of your role, and the book tells you to follow your local protocol whenever it differs.</w:t>
       </w:r>
     </w:p>
     <w:p>
@@ -2638,7 +2638,23 @@
           <w:bCs/>
           <w:b/>
         </w:rPr>
-        <w:t xml:space="preserve">Who it serves</w:t>
+        <w:t xml:space="preserve">Written to be read and revisited</w:t>
+      </w:r>
+    </w:p>
+    <w:p>
+      <w:pPr>
+        <w:pStyle w:val="BodyText"/>
+      </w:pPr>
+      <w:r>
+        <w:t xml:space="preserve">The writing is plain and direct, with complete explanations in place of fragments, so a first-time reader can follow the reasoning and a returning reader can find the step they need. Entries for children, older adults and pregnancy show how the usual approach changes, while the early Parts give the shared method that the later Parts build on. The result is a connected course in the fundamentals, not a loose collection of lists.</w:t>
+      </w:r>
+    </w:p>
+    <w:p>
+      <w:pPr>
+        <w:pStyle w:val="BodyText"/>
+      </w:pPr>
+      <w:r>
+        <w:t xml:space="preserve">Illustrative cases close each Part and are fictional composites written for teaching. They follow a call from arrival to handover, showing how safety, assessment, treatment and communication fit together in a single response.</w:t>
       </w:r>
     </w:p>
     <w:p>
@@ -2650,23 +2666,7 @@
           <w:bCs/>
           <w:b/>
         </w:rPr>
-        <w:t xml:space="preserve">Written to be read and revisited</w:t>
-      </w:r>
-    </w:p>
-    <w:p>
-      <w:pPr>
-        <w:pStyle w:val="BodyText"/>
-      </w:pPr>
-      <w:r>
-        <w:t xml:space="preserve">The writing is plain and direct, with complete explanations in place of fragments, so a first-time reader can follow the reasoning and a returning reader can find the step they need. Entries for children, older adults and pregnancy show how the usual approach changes, while the early Parts give the shared method that the later Parts build on. The result is a connected course in the fundamentals, not a loose collection of lists.</w:t>
-      </w:r>
-    </w:p>
-    <w:p>
-      <w:pPr>
-        <w:pStyle w:val="BodyText"/>
-      </w:pPr>
-      <w:r>
-        <w:t xml:space="preserve">Illustrative cases close each Part and are fictional composites written for teaching. They follow a call from arrival to handover, showing how safety, assessment, treatment and communication fit together in a single response.</w:t>
+        <w:t xml:space="preserve">Who it serves</w:t>
       </w:r>
     </w:p>
     <w:p>
@@ -2704,7 +2704,7 @@
           <w:iCs/>
           <w:i/>
         </w:rPr>
-        <w:t xml:space="preserve">2558 characters including tags (limit 4,000).</w:t>
+        <w:t xml:space="preserve">2575 characters including tags (limit 4,000).</w:t>
       </w:r>
     </w:p>
     <w:p>
@@ -2841,7 +2841,7 @@
         <w:rPr>
           <w:rStyle w:val="NormalTok"/>
         </w:rPr>
-        <w:t xml:space="preserve">Six Parts, 45 entries</w:t>
+        <w:t xml:space="preserve">Six Parts, 33 entries</w:t>
       </w:r>
       <w:r>
         <w:rPr>
@@ -3369,7 +3369,7 @@
         <w:rPr>
           <w:rStyle w:val="NormalTok"/>
         </w:rPr>
-        <w:t xml:space="preserve">Twenty-five figures, numbered procedure boxes, illustrative cases, review questions with answers, a 68-term glossary and an index make the content easy to revisit. Procedures state their scope, and the book tells you to follow your local protocol whenever it differs.</w:t>
+        <w:t xml:space="preserve">Twenty-five figures, numbered procedure boxes, illustrative cases, review questions with answers, a 68-term glossary and an index make the content easy to revisit. Scope Note boxes mark the limits of your role, and the book tells you to follow your local protocol whenever it differs.</w:t>
       </w:r>
       <w:r>
         <w:rPr>
@@ -3405,6 +3405,114 @@
         <w:rPr>
           <w:rStyle w:val="NormalTok"/>
         </w:rPr>
+        <w:t xml:space="preserve">Written to be read and revisited</w:t>
+      </w:r>
+      <w:r>
+        <w:rPr>
+          <w:rStyle w:val="DataTypeTok"/>
+        </w:rPr>
+        <w:t xml:space="preserve">&lt;/</w:t>
+      </w:r>
+      <w:r>
+        <w:rPr>
+          <w:rStyle w:val="KeywordTok"/>
+        </w:rPr>
+        <w:t xml:space="preserve">h5</w:t>
+      </w:r>
+      <w:r>
+        <w:rPr>
+          <w:rStyle w:val="DataTypeTok"/>
+        </w:rPr>
+        <w:t xml:space="preserve">&gt;&lt;</w:t>
+      </w:r>
+      <w:r>
+        <w:rPr>
+          <w:rStyle w:val="KeywordTok"/>
+        </w:rPr>
+        <w:t xml:space="preserve">p</w:t>
+      </w:r>
+      <w:r>
+        <w:rPr>
+          <w:rStyle w:val="DataTypeTok"/>
+        </w:rPr>
+        <w:t xml:space="preserve">&gt;</w:t>
+      </w:r>
+      <w:r>
+        <w:rPr>
+          <w:rStyle w:val="NormalTok"/>
+        </w:rPr>
+        <w:t xml:space="preserve">The writing is plain and direct, with complete explanations in place of fragments, so a first-time reader can follow the reasoning and a returning reader can find the step they need. Entries for children, older adults and pregnancy show how the usual approach changes, while the early Parts give the shared method that the later Parts build on. The result is a connected course in the fundamentals, not a loose collection of lists.</w:t>
+      </w:r>
+      <w:r>
+        <w:rPr>
+          <w:rStyle w:val="DataTypeTok"/>
+        </w:rPr>
+        <w:t xml:space="preserve">&lt;/</w:t>
+      </w:r>
+      <w:r>
+        <w:rPr>
+          <w:rStyle w:val="KeywordTok"/>
+        </w:rPr>
+        <w:t xml:space="preserve">p</w:t>
+      </w:r>
+      <w:r>
+        <w:rPr>
+          <w:rStyle w:val="DataTypeTok"/>
+        </w:rPr>
+        <w:t xml:space="preserve">&gt;&lt;</w:t>
+      </w:r>
+      <w:r>
+        <w:rPr>
+          <w:rStyle w:val="KeywordTok"/>
+        </w:rPr>
+        <w:t xml:space="preserve">p</w:t>
+      </w:r>
+      <w:r>
+        <w:rPr>
+          <w:rStyle w:val="DataTypeTok"/>
+        </w:rPr>
+        <w:t xml:space="preserve">&gt;</w:t>
+      </w:r>
+      <w:r>
+        <w:rPr>
+          <w:rStyle w:val="NormalTok"/>
+        </w:rPr>
+        <w:t xml:space="preserve">Illustrative cases close each Part and are fictional composites written for teaching. They follow a call from arrival to handover, showing how safety, assessment, treatment and communication fit together in a single response.</w:t>
+      </w:r>
+      <w:r>
+        <w:rPr>
+          <w:rStyle w:val="DataTypeTok"/>
+        </w:rPr>
+        <w:t xml:space="preserve">&lt;/</w:t>
+      </w:r>
+      <w:r>
+        <w:rPr>
+          <w:rStyle w:val="KeywordTok"/>
+        </w:rPr>
+        <w:t xml:space="preserve">p</w:t>
+      </w:r>
+      <w:r>
+        <w:rPr>
+          <w:rStyle w:val="DataTypeTok"/>
+        </w:rPr>
+        <w:t xml:space="preserve">&gt;&lt;</w:t>
+      </w:r>
+      <w:r>
+        <w:rPr>
+          <w:rStyle w:val="KeywordTok"/>
+        </w:rPr>
+        <w:t xml:space="preserve">h5</w:t>
+      </w:r>
+      <w:r>
+        <w:rPr>
+          <w:rStyle w:val="DataTypeTok"/>
+        </w:rPr>
+        <w:t xml:space="preserve">&gt;</w:t>
+      </w:r>
+      <w:r>
+        <w:rPr>
+          <w:rStyle w:val="NormalTok"/>
+        </w:rPr>
         <w:t xml:space="preserve">Who it serves</w:t>
       </w:r>
       <w:r>
@@ -3418,114 +3526,6 @@
           <w:rStyle w:val="KeywordTok"/>
         </w:rPr>
         <w:t xml:space="preserve">h5</w:t>
-      </w:r>
-      <w:r>
-        <w:rPr>
-          <w:rStyle w:val="DataTypeTok"/>
-        </w:rPr>
-        <w:t xml:space="preserve">&gt;&lt;</w:t>
-      </w:r>
-      <w:r>
-        <w:rPr>
-          <w:rStyle w:val="KeywordTok"/>
-        </w:rPr>
-        <w:t xml:space="preserve">h5</w:t>
-      </w:r>
-      <w:r>
-        <w:rPr>
-          <w:rStyle w:val="DataTypeTok"/>
-        </w:rPr>
-        <w:t xml:space="preserve">&gt;</w:t>
-      </w:r>
-      <w:r>
-        <w:rPr>
-          <w:rStyle w:val="NormalTok"/>
-        </w:rPr>
-        <w:t xml:space="preserve">Written to be read and revisited</w:t>
-      </w:r>
-      <w:r>
-        <w:rPr>
-          <w:rStyle w:val="DataTypeTok"/>
-        </w:rPr>
-        <w:t xml:space="preserve">&lt;/</w:t>
-      </w:r>
-      <w:r>
-        <w:rPr>
-          <w:rStyle w:val="KeywordTok"/>
-        </w:rPr>
-        <w:t xml:space="preserve">h5</w:t>
-      </w:r>
-      <w:r>
-        <w:rPr>
-          <w:rStyle w:val="DataTypeTok"/>
-        </w:rPr>
-        <w:t xml:space="preserve">&gt;&lt;</w:t>
-      </w:r>
-      <w:r>
-        <w:rPr>
-          <w:rStyle w:val="KeywordTok"/>
-        </w:rPr>
-        <w:t xml:space="preserve">p</w:t>
-      </w:r>
-      <w:r>
-        <w:rPr>
-          <w:rStyle w:val="DataTypeTok"/>
-        </w:rPr>
-        <w:t xml:space="preserve">&gt;</w:t>
-      </w:r>
-      <w:r>
-        <w:rPr>
-          <w:rStyle w:val="NormalTok"/>
-        </w:rPr>
-        <w:t xml:space="preserve">The writing is plain and direct, with complete explanations in place of fragments, so a first-time reader can follow the reasoning and a returning reader can find the step they need. Entries for children, older adults and pregnancy show how the usual approach changes, while the early Parts give the shared method that the later Parts build on. The result is a connected course in the fundamentals, not a loose collection of lists.</w:t>
-      </w:r>
-      <w:r>
-        <w:rPr>
-          <w:rStyle w:val="DataTypeTok"/>
-        </w:rPr>
-        <w:t xml:space="preserve">&lt;/</w:t>
-      </w:r>
-      <w:r>
-        <w:rPr>
-          <w:rStyle w:val="KeywordTok"/>
-        </w:rPr>
-        <w:t xml:space="preserve">p</w:t>
-      </w:r>
-      <w:r>
-        <w:rPr>
-          <w:rStyle w:val="DataTypeTok"/>
-        </w:rPr>
-        <w:t xml:space="preserve">&gt;&lt;</w:t>
-      </w:r>
-      <w:r>
-        <w:rPr>
-          <w:rStyle w:val="KeywordTok"/>
-        </w:rPr>
-        <w:t xml:space="preserve">p</w:t>
-      </w:r>
-      <w:r>
-        <w:rPr>
-          <w:rStyle w:val="DataTypeTok"/>
-        </w:rPr>
-        <w:t xml:space="preserve">&gt;</w:t>
-      </w:r>
-      <w:r>
-        <w:rPr>
-          <w:rStyle w:val="NormalTok"/>
-        </w:rPr>
-        <w:t xml:space="preserve">Illustrative cases close each Part and are fictional composites written for teaching. They follow a call from arrival to handover, showing how safety, assessment, treatment and communication fit together in a single response.</w:t>
-      </w:r>
-      <w:r>
-        <w:rPr>
-          <w:rStyle w:val="DataTypeTok"/>
-        </w:rPr>
-        <w:t xml:space="preserve">&lt;/</w:t>
-      </w:r>
-      <w:r>
-        <w:rPr>
-          <w:rStyle w:val="KeywordTok"/>
-        </w:rPr>
-        <w:t xml:space="preserve">p</w:t>
       </w:r>
       <w:r>
         <w:rPr>
@@ -4240,7 +4240,7 @@
           <w:iCs/>
           <w:i/>
         </w:rPr>
-        <w:t xml:space="preserve">423 words.</w:t>
+        <w:t xml:space="preserve">402 words.</w:t>
       </w:r>
     </w:p>
     <w:p>
@@ -4376,7 +4376,7 @@
         <w:pStyle w:val="BodyText"/>
       </w:pPr>
       <w:r>
-        <w:t xml:space="preserve">Six Parts and 45 numbered entries make topics easy to find. Twenty-five figures show anatomy, decision paths and technique. Safety, Red Flags and Scope Note boxes mark what matters most. Every Part closes with an illustrative case, a summary of care priorities and eight review questions with answers. A 68-term glossary and an index finish the book.</w:t>
+        <w:t xml:space="preserve">Six Parts and 33 numbered entries make topics easy to find. Twenty-five figures show anatomy, decision paths and technique. Safety, Red Flags and Scope Note boxes mark what matters most. Every Part closes with an illustrative case, a summary of care priorities and eight review questions with answers. A 68-term glossary and an index finish the book.</w:t>
       </w:r>
     </w:p>
     <w:p>
@@ -4388,7 +4388,15 @@
           <w:bCs/>
           <w:b/>
         </w:rPr>
-        <w:t xml:space="preserve">Who it is for</w:t>
+        <w:t xml:space="preserve">Why the order matters</w:t>
+      </w:r>
+    </w:p>
+    <w:p>
+      <w:pPr>
+        <w:pStyle w:val="BodyText"/>
+      </w:pPr>
+      <w:r>
+        <w:t xml:space="preserve">Each entry gives the reason behind its steps, so you understand why a scene check comes before everything, why the primary survey runs in a fixed order, and why a patient who looks well can still be sick. Knowing the reason makes the sequence easier to remember.</w:t>
       </w:r>
     </w:p>
     <w:p>
@@ -4400,7 +4408,7 @@
           <w:bCs/>
           <w:b/>
         </w:rPr>
-        <w:t xml:space="preserve">Why the order matters</w:t>
+        <w:t xml:space="preserve">Clear limits, honest scope</w:t>
       </w:r>
     </w:p>
     <w:p>
@@ -4408,7 +4416,7 @@
         <w:pStyle w:val="BodyText"/>
       </w:pPr>
       <w:r>
-        <w:t xml:space="preserve">Most mistakes in the first minutes of an emergency come from skipping a step, not from missing a rare fact. Each entry gives the reason behind its steps, so you understand why airway comes first, why a scene check comes before everything, and why a patient who looks well can still be sick. Understanding the reason helps you remember the sequence and adapt when a real patient does not match the picture in your mind.</w:t>
+        <w:t xml:space="preserve">Scope Note boxes mark the limits of your role, and procedures tell you when to stop and when to call for more help. The book also says plainly what it leaves out, such as medicine amounts, intravenous access, detailed heart tracing interpretation and advanced airway skills, so you always know where the guide ends and your training begins.</w:t>
       </w:r>
     </w:p>
     <w:p>
@@ -4420,15 +4428,7 @@
           <w:bCs/>
           <w:b/>
         </w:rPr>
-        <w:t xml:space="preserve">Clear limits, honest scope</w:t>
-      </w:r>
-    </w:p>
-    <w:p>
-      <w:pPr>
-        <w:pStyle w:val="BodyText"/>
-      </w:pPr>
-      <w:r>
-        <w:t xml:space="preserve">Every procedure states its scope, tells you when to stop and when to call for more help. The book also says plainly what it leaves out, such as medicine amounts, intravenous access, reading heart tracings and advanced airway skills, so you always know where the guide ends and your training begins.</w:t>
+        <w:t xml:space="preserve">Who it is for</w:t>
       </w:r>
     </w:p>
     <w:p>
@@ -4466,7 +4466,7 @@
           <w:iCs/>
           <w:i/>
         </w:rPr>
-        <w:t xml:space="preserve">2663 characters including tags (limit 4,000).</w:t>
+        <w:t xml:space="preserve">2549 characters including tags (limit 4,000).</w:t>
       </w:r>
     </w:p>
     <w:p>
@@ -4963,7 +4963,7 @@
         <w:rPr>
           <w:rStyle w:val="NormalTok"/>
         </w:rPr>
-        <w:t xml:space="preserve">Six Parts and 45 numbered entries make topics easy to find. Twenty-five figures show anatomy, decision paths and technique. Safety, Red Flags and Scope Note boxes mark what matters most. Every Part closes with an illustrative case, a summary of care priorities and eight review questions with answers. A 68-term glossary and an index finish the book.</w:t>
+        <w:t xml:space="preserve">Six Parts and 33 numbered entries make topics easy to find. Twenty-five figures show anatomy, decision paths and technique. Safety, Red Flags and Scope Note boxes mark what matters most. Every Part closes with an illustrative case, a summary of care priorities and eight review questions with answers. A 68-term glossary and an index finish the book.</w:t>
       </w:r>
       <w:r>
         <w:rPr>
@@ -4999,6 +4999,150 @@
         <w:rPr>
           <w:rStyle w:val="NormalTok"/>
         </w:rPr>
+        <w:t xml:space="preserve">Why the order matters</w:t>
+      </w:r>
+      <w:r>
+        <w:rPr>
+          <w:rStyle w:val="DataTypeTok"/>
+        </w:rPr>
+        <w:t xml:space="preserve">&lt;/</w:t>
+      </w:r>
+      <w:r>
+        <w:rPr>
+          <w:rStyle w:val="KeywordTok"/>
+        </w:rPr>
+        <w:t xml:space="preserve">h5</w:t>
+      </w:r>
+      <w:r>
+        <w:rPr>
+          <w:rStyle w:val="DataTypeTok"/>
+        </w:rPr>
+        <w:t xml:space="preserve">&gt;&lt;</w:t>
+      </w:r>
+      <w:r>
+        <w:rPr>
+          <w:rStyle w:val="KeywordTok"/>
+        </w:rPr>
+        <w:t xml:space="preserve">p</w:t>
+      </w:r>
+      <w:r>
+        <w:rPr>
+          <w:rStyle w:val="DataTypeTok"/>
+        </w:rPr>
+        <w:t xml:space="preserve">&gt;</w:t>
+      </w:r>
+      <w:r>
+        <w:rPr>
+          <w:rStyle w:val="NormalTok"/>
+        </w:rPr>
+        <w:t xml:space="preserve">Each entry gives the reason behind its steps, so you understand why a scene check comes before everything, why the primary survey runs in a fixed order, and why a patient who looks well can still be sick. Knowing the reason makes the sequence easier to remember.</w:t>
+      </w:r>
+      <w:r>
+        <w:rPr>
+          <w:rStyle w:val="DataTypeTok"/>
+        </w:rPr>
+        <w:t xml:space="preserve">&lt;/</w:t>
+      </w:r>
+      <w:r>
+        <w:rPr>
+          <w:rStyle w:val="KeywordTok"/>
+        </w:rPr>
+        <w:t xml:space="preserve">p</w:t>
+      </w:r>
+      <w:r>
+        <w:rPr>
+          <w:rStyle w:val="DataTypeTok"/>
+        </w:rPr>
+        <w:t xml:space="preserve">&gt;&lt;</w:t>
+      </w:r>
+      <w:r>
+        <w:rPr>
+          <w:rStyle w:val="KeywordTok"/>
+        </w:rPr>
+        <w:t xml:space="preserve">h5</w:t>
+      </w:r>
+      <w:r>
+        <w:rPr>
+          <w:rStyle w:val="DataTypeTok"/>
+        </w:rPr>
+        <w:t xml:space="preserve">&gt;</w:t>
+      </w:r>
+      <w:r>
+        <w:rPr>
+          <w:rStyle w:val="NormalTok"/>
+        </w:rPr>
+        <w:t xml:space="preserve">Clear limits, honest scope</w:t>
+      </w:r>
+      <w:r>
+        <w:rPr>
+          <w:rStyle w:val="DataTypeTok"/>
+        </w:rPr>
+        <w:t xml:space="preserve">&lt;/</w:t>
+      </w:r>
+      <w:r>
+        <w:rPr>
+          <w:rStyle w:val="KeywordTok"/>
+        </w:rPr>
+        <w:t xml:space="preserve">h5</w:t>
+      </w:r>
+      <w:r>
+        <w:rPr>
+          <w:rStyle w:val="DataTypeTok"/>
+        </w:rPr>
+        <w:t xml:space="preserve">&gt;&lt;</w:t>
+      </w:r>
+      <w:r>
+        <w:rPr>
+          <w:rStyle w:val="KeywordTok"/>
+        </w:rPr>
+        <w:t xml:space="preserve">p</w:t>
+      </w:r>
+      <w:r>
+        <w:rPr>
+          <w:rStyle w:val="DataTypeTok"/>
+        </w:rPr>
+        <w:t xml:space="preserve">&gt;</w:t>
+      </w:r>
+      <w:r>
+        <w:rPr>
+          <w:rStyle w:val="NormalTok"/>
+        </w:rPr>
+        <w:t xml:space="preserve">Scope Note boxes mark the limits of your role, and procedures tell you when to stop and when to call for more help. The book also says plainly what it leaves out, such as medicine amounts, intravenous access, detailed heart tracing interpretation and advanced airway skills, so you always know where the guide ends and your training begins.</w:t>
+      </w:r>
+      <w:r>
+        <w:rPr>
+          <w:rStyle w:val="DataTypeTok"/>
+        </w:rPr>
+        <w:t xml:space="preserve">&lt;/</w:t>
+      </w:r>
+      <w:r>
+        <w:rPr>
+          <w:rStyle w:val="KeywordTok"/>
+        </w:rPr>
+        <w:t xml:space="preserve">p</w:t>
+      </w:r>
+      <w:r>
+        <w:rPr>
+          <w:rStyle w:val="DataTypeTok"/>
+        </w:rPr>
+        <w:t xml:space="preserve">&gt;&lt;</w:t>
+      </w:r>
+      <w:r>
+        <w:rPr>
+          <w:rStyle w:val="KeywordTok"/>
+        </w:rPr>
+        <w:t xml:space="preserve">h5</w:t>
+      </w:r>
+      <w:r>
+        <w:rPr>
+          <w:rStyle w:val="DataTypeTok"/>
+        </w:rPr>
+        <w:t xml:space="preserve">&gt;</w:t>
+      </w:r>
+      <w:r>
+        <w:rPr>
+          <w:rStyle w:val="NormalTok"/>
+        </w:rPr>
         <w:t xml:space="preserve">Who it is for</w:t>
       </w:r>
       <w:r>
@@ -5023,7 +5167,7 @@
         <w:rPr>
           <w:rStyle w:val="KeywordTok"/>
         </w:rPr>
-        <w:t xml:space="preserve">h5</w:t>
+        <w:t xml:space="preserve">p</w:t>
       </w:r>
       <w:r>
         <w:rPr>
@@ -5035,7 +5179,7 @@
         <w:rPr>
           <w:rStyle w:val="NormalTok"/>
         </w:rPr>
-        <w:t xml:space="preserve">Why the order matters</w:t>
+        <w:t xml:space="preserve">Nursing, paramedic, EMT and allied health students, and new responders who want a clear first guide to emergency care. It is written in plain language for United States practice. It gives no medicine doses and does not replace your course, instructor, local protocol or medical direction.</w:t>
       </w:r>
       <w:r>
         <w:rPr>
@@ -5047,7 +5191,7 @@
         <w:rPr>
           <w:rStyle w:val="KeywordTok"/>
         </w:rPr>
-        <w:t xml:space="preserve">h5</w:t>
+        <w:t xml:space="preserve">p</w:t>
       </w:r>
       <w:r>
         <w:rPr>
@@ -5065,13 +5209,25 @@
         <w:rPr>
           <w:rStyle w:val="DataTypeTok"/>
         </w:rPr>
+        <w:t xml:space="preserve">&gt;&lt;</w:t>
+      </w:r>
+      <w:r>
+        <w:rPr>
+          <w:rStyle w:val="KeywordTok"/>
+        </w:rPr>
+        <w:t xml:space="preserve">b</w:t>
+      </w:r>
+      <w:r>
+        <w:rPr>
+          <w:rStyle w:val="DataTypeTok"/>
+        </w:rPr>
         <w:t xml:space="preserve">&gt;</w:t>
       </w:r>
       <w:r>
         <w:rPr>
           <w:rStyle w:val="NormalTok"/>
         </w:rPr>
-        <w:t xml:space="preserve">Most mistakes in the first minutes of an emergency come from skipping a step, not from missing a rare fact. Each entry gives the reason behind its steps, so you understand why airway comes first, why a scene check comes before everything, and why a patient who looks well can still be sick. Understanding the reason helps you remember the sequence and adapt when a real patient does not match the picture in your mind.</w:t>
+        <w:t xml:space="preserve">Open it at Part 1, learn the order of thinking, and carry it into your next lab, placement or shift.</w:t>
       </w:r>
       <w:r>
         <w:rPr>
@@ -5083,191 +5239,35 @@
         <w:rPr>
           <w:rStyle w:val="KeywordTok"/>
         </w:rPr>
+        <w:t xml:space="preserve">b</w:t>
+      </w:r>
+      <w:r>
+        <w:rPr>
+          <w:rStyle w:val="DataTypeTok"/>
+        </w:rPr>
+        <w:t xml:space="preserve">&gt;&lt;/</w:t>
+      </w:r>
+      <w:r>
+        <w:rPr>
+          <w:rStyle w:val="KeywordTok"/>
+        </w:rPr>
         <w:t xml:space="preserve">p</w:t>
       </w:r>
       <w:r>
         <w:rPr>
           <w:rStyle w:val="DataTypeTok"/>
         </w:rPr>
-        <w:t xml:space="preserve">&gt;&lt;</w:t>
-      </w:r>
-      <w:r>
-        <w:rPr>
-          <w:rStyle w:val="KeywordTok"/>
-        </w:rPr>
-        <w:t xml:space="preserve">h5</w:t>
-      </w:r>
-      <w:r>
-        <w:rPr>
-          <w:rStyle w:val="DataTypeTok"/>
-        </w:rPr>
         <w:t xml:space="preserve">&gt;</w:t>
       </w:r>
-      <w:r>
-        <w:rPr>
-          <w:rStyle w:val="NormalTok"/>
-        </w:rPr>
-        <w:t xml:space="preserve">Clear limits, honest scope</w:t>
-      </w:r>
-      <w:r>
-        <w:rPr>
-          <w:rStyle w:val="DataTypeTok"/>
-        </w:rPr>
-        <w:t xml:space="preserve">&lt;/</w:t>
-      </w:r>
-      <w:r>
-        <w:rPr>
-          <w:rStyle w:val="KeywordTok"/>
-        </w:rPr>
-        <w:t xml:space="preserve">h5</w:t>
-      </w:r>
-      <w:r>
-        <w:rPr>
-          <w:rStyle w:val="DataTypeTok"/>
-        </w:rPr>
-        <w:t xml:space="preserve">&gt;&lt;</w:t>
-      </w:r>
-      <w:r>
-        <w:rPr>
-          <w:rStyle w:val="KeywordTok"/>
-        </w:rPr>
-        <w:t xml:space="preserve">p</w:t>
-      </w:r>
-      <w:r>
-        <w:rPr>
-          <w:rStyle w:val="DataTypeTok"/>
-        </w:rPr>
-        <w:t xml:space="preserve">&gt;</w:t>
-      </w:r>
-      <w:r>
-        <w:rPr>
-          <w:rStyle w:val="NormalTok"/>
-        </w:rPr>
-        <w:t xml:space="preserve">Every procedure states its scope, tells you when to stop and when to call for more help. The book also says plainly what it leaves out, such as medicine amounts, intravenous access, reading heart tracings and advanced airway skills, so you always know where the guide ends and your training begins.</w:t>
-      </w:r>
-      <w:r>
-        <w:rPr>
-          <w:rStyle w:val="DataTypeTok"/>
-        </w:rPr>
-        <w:t xml:space="preserve">&lt;/</w:t>
-      </w:r>
-      <w:r>
-        <w:rPr>
-          <w:rStyle w:val="KeywordTok"/>
-        </w:rPr>
-        <w:t xml:space="preserve">p</w:t>
-      </w:r>
-      <w:r>
-        <w:rPr>
-          <w:rStyle w:val="DataTypeTok"/>
-        </w:rPr>
-        <w:t xml:space="preserve">&gt;&lt;</w:t>
-      </w:r>
-      <w:r>
-        <w:rPr>
-          <w:rStyle w:val="KeywordTok"/>
-        </w:rPr>
-        <w:t xml:space="preserve">p</w:t>
-      </w:r>
-      <w:r>
-        <w:rPr>
-          <w:rStyle w:val="DataTypeTok"/>
-        </w:rPr>
-        <w:t xml:space="preserve">&gt;</w:t>
-      </w:r>
-      <w:r>
-        <w:rPr>
-          <w:rStyle w:val="NormalTok"/>
-        </w:rPr>
-        <w:t xml:space="preserve">Nursing, paramedic, EMT and allied health students, and new responders who want a clear first guide to emergency care. It is written in plain language for United States practice. It gives no medicine doses and does not replace your course, instructor, local protocol or medical direction.</w:t>
-      </w:r>
-      <w:r>
-        <w:rPr>
-          <w:rStyle w:val="DataTypeTok"/>
-        </w:rPr>
-        <w:t xml:space="preserve">&lt;/</w:t>
-      </w:r>
-      <w:r>
-        <w:rPr>
-          <w:rStyle w:val="KeywordTok"/>
-        </w:rPr>
-        <w:t xml:space="preserve">p</w:t>
-      </w:r>
-      <w:r>
-        <w:rPr>
-          <w:rStyle w:val="DataTypeTok"/>
-        </w:rPr>
-        <w:t xml:space="preserve">&gt;&lt;</w:t>
-      </w:r>
-      <w:r>
-        <w:rPr>
-          <w:rStyle w:val="KeywordTok"/>
-        </w:rPr>
-        <w:t xml:space="preserve">p</w:t>
-      </w:r>
-      <w:r>
-        <w:rPr>
-          <w:rStyle w:val="DataTypeTok"/>
-        </w:rPr>
-        <w:t xml:space="preserve">&gt;&lt;</w:t>
-      </w:r>
-      <w:r>
-        <w:rPr>
-          <w:rStyle w:val="KeywordTok"/>
-        </w:rPr>
-        <w:t xml:space="preserve">b</w:t>
-      </w:r>
-      <w:r>
-        <w:rPr>
-          <w:rStyle w:val="DataTypeTok"/>
-        </w:rPr>
-        <w:t xml:space="preserve">&gt;</w:t>
-      </w:r>
-      <w:r>
-        <w:rPr>
-          <w:rStyle w:val="NormalTok"/>
-        </w:rPr>
-        <w:t xml:space="preserve">Open it at Part 1, learn the order of thinking, and carry it into your next lab, placement or shift.</w:t>
-      </w:r>
-      <w:r>
-        <w:rPr>
-          <w:rStyle w:val="DataTypeTok"/>
-        </w:rPr>
-        <w:t xml:space="preserve">&lt;/</w:t>
-      </w:r>
-      <w:r>
-        <w:rPr>
-          <w:rStyle w:val="KeywordTok"/>
-        </w:rPr>
-        <w:t xml:space="preserve">b</w:t>
-      </w:r>
-      <w:r>
-        <w:rPr>
-          <w:rStyle w:val="DataTypeTok"/>
-        </w:rPr>
-        <w:t xml:space="preserve">&gt;&lt;/</w:t>
-      </w:r>
-      <w:r>
-        <w:rPr>
-          <w:rStyle w:val="KeywordTok"/>
-        </w:rPr>
-        <w:t xml:space="preserve">p</w:t>
-      </w:r>
-      <w:r>
-        <w:rPr>
-          <w:rStyle w:val="DataTypeTok"/>
-        </w:rPr>
-        <w:t xml:space="preserve">&gt;</w:t>
-      </w:r>
     </w:p>
     <w:bookmarkEnd w:id="35"/>
-    <w:bookmarkStart w:id="36" w:name="initial-keyword-shortlist-26-phrases"/>
+    <w:bookmarkStart w:id="36" w:name="initial-keyword-shortlist-29-phrases"/>
     <w:p>
       <w:pPr>
         <w:pStyle w:val="Heading2"/>
       </w:pPr>
       <w:r>
-        <w:t xml:space="preserve">17. Initial keyword shortlist (26 phrases)</w:t>
+        <w:t xml:space="preserve">17. Initial keyword shortlist (29 phrases)</w:t>
       </w:r>
     </w:p>
     <w:tbl>
@@ -5344,7 +5344,7 @@
               <w:jc w:val="left"/>
             </w:pPr>
             <w:r>
-              <w:t xml:space="preserve">primary survey and secondary survey</w:t>
+              <w:t xml:space="preserve">primary and secondary survey</w:t>
             </w:r>
           </w:p>
         </w:tc>
@@ -5534,7 +5534,7 @@
               <w:jc w:val="left"/>
             </w:pPr>
             <w:r>
-              <w:t xml:space="preserve">study book for first responders</w:t>
+              <w:t xml:space="preserve">scene safety and vital signs</w:t>
             </w:r>
           </w:p>
         </w:tc>
@@ -5572,7 +5572,7 @@
               <w:jc w:val="left"/>
             </w:pPr>
             <w:r>
-              <w:t xml:space="preserve">emergency department clinical rotation</w:t>
+              <w:t xml:space="preserve">handover and documentation skills</w:t>
             </w:r>
           </w:p>
         </w:tc>
@@ -5906,7 +5906,7 @@
               <w:jc w:val="left"/>
             </w:pPr>
             <w:r>
-              <w:t xml:space="preserve">Rejected: appears once in the manuscript; weak fit</w:t>
+              <w:t xml:space="preserve">Rejected: Entry 1.3 teaches the ABCDE order, but the string appears only once in the text, no autocomplete evidence, and the letters read as an abbreviation not a search phrase</w:t>
             </w:r>
           </w:p>
         </w:tc>
@@ -6399,6 +6399,154 @@
             </w:pPr>
             <w:r>
               <w:t xml:space="preserve">Rejected: a competitor’s title</w:t>
+            </w:r>
+          </w:p>
+        </w:tc>
+      </w:tr>
+      <w:tr>
+        <w:tc>
+          <w:tcPr/>
+          <w:p>
+            <w:pPr>
+              <w:pStyle w:val="Compact"/>
+              <w:jc w:val="left"/>
+            </w:pPr>
+            <w:r>
+              <w:t xml:space="preserve">28</w:t>
+            </w:r>
+          </w:p>
+        </w:tc>
+        <w:tc>
+          <w:tcPr/>
+          <w:p>
+            <w:pPr>
+              <w:pStyle w:val="Compact"/>
+              <w:jc w:val="left"/>
+            </w:pPr>
+            <w:r>
+              <w:t xml:space="preserve">study book for first responders</w:t>
+            </w:r>
+          </w:p>
+        </w:tc>
+        <w:tc>
+          <w:tcPr/>
+          <w:p>
+            <w:pPr>
+              <w:pStyle w:val="Compact"/>
+              <w:jc w:val="left"/>
+            </w:pPr>
+            <w:r>
+              <w:t xml:space="preserve">Rejected after review:</w:t>
+            </w:r>
+            <w:r>
+              <w:t xml:space="preserve"> </w:t>
+            </w:r>
+            <w:r>
+              <w:t xml:space="preserve">‘</w:t>
+            </w:r>
+            <w:r>
+              <w:t xml:space="preserve">book</w:t>
+            </w:r>
+            <w:r>
+              <w:t xml:space="preserve">’</w:t>
+            </w:r>
+            <w:r>
+              <w:t xml:space="preserve"> </w:t>
+            </w:r>
+            <w:r>
+              <w:t xml:space="preserve">is a generic word KDP advises against and</w:t>
+            </w:r>
+            <w:r>
+              <w:t xml:space="preserve"> </w:t>
+            </w:r>
+            <w:r>
+              <w:t xml:space="preserve">‘</w:t>
+            </w:r>
+            <w:r>
+              <w:t xml:space="preserve">first responders</w:t>
+            </w:r>
+            <w:r>
+              <w:t xml:space="preserve">’</w:t>
+            </w:r>
+            <w:r>
+              <w:t xml:space="preserve"> </w:t>
+            </w:r>
+            <w:r>
+              <w:t xml:space="preserve">is not used in the manuscript</w:t>
+            </w:r>
+          </w:p>
+        </w:tc>
+      </w:tr>
+      <w:tr>
+        <w:tc>
+          <w:tcPr/>
+          <w:p>
+            <w:pPr>
+              <w:pStyle w:val="Compact"/>
+              <w:jc w:val="left"/>
+            </w:pPr>
+            <w:r>
+              <w:t xml:space="preserve">29</w:t>
+            </w:r>
+          </w:p>
+        </w:tc>
+        <w:tc>
+          <w:tcPr/>
+          <w:p>
+            <w:pPr>
+              <w:pStyle w:val="Compact"/>
+              <w:jc w:val="left"/>
+            </w:pPr>
+            <w:r>
+              <w:t xml:space="preserve">emergency department clinical rotation</w:t>
+            </w:r>
+          </w:p>
+        </w:tc>
+        <w:tc>
+          <w:tcPr/>
+          <w:p>
+            <w:pPr>
+              <w:pStyle w:val="Compact"/>
+              <w:jc w:val="left"/>
+            </w:pPr>
+            <w:r>
+              <w:t xml:space="preserve">Rejected after review: repeats</w:t>
+            </w:r>
+            <w:r>
+              <w:t xml:space="preserve"> </w:t>
+            </w:r>
+            <w:r>
+              <w:t xml:space="preserve">‘</w:t>
+            </w:r>
+            <w:r>
+              <w:t xml:space="preserve">emergency</w:t>
+            </w:r>
+            <w:r>
+              <w:t xml:space="preserve">’</w:t>
+            </w:r>
+            <w:r>
+              <w:t xml:space="preserve"> </w:t>
+            </w:r>
+            <w:r>
+              <w:t xml:space="preserve">from the title,</w:t>
+            </w:r>
+            <w:r>
+              <w:t xml:space="preserve"> </w:t>
+            </w:r>
+            <w:r>
+              <w:t xml:space="preserve">‘</w:t>
+            </w:r>
+            <w:r>
+              <w:t xml:space="preserve">rotation</w:t>
+            </w:r>
+            <w:r>
+              <w:t xml:space="preserve">’</w:t>
+            </w:r>
+            <w:r>
+              <w:t xml:space="preserve"> </w:t>
+            </w:r>
+            <w:r>
+              <w:t xml:space="preserve">is not in the manuscript, no evidence</w:t>
             </w:r>
           </w:p>
         </w:tc>
@@ -6431,7 +6579,7 @@
         <w:pStyle w:val="Compact"/>
       </w:pPr>
       <w:r>
-        <w:t xml:space="preserve">primary survey and secondary survey</w:t>
+        <w:t xml:space="preserve">primary and secondary survey</w:t>
       </w:r>
     </w:p>
     <w:p>
@@ -6491,7 +6639,7 @@
         <w:pStyle w:val="Compact"/>
       </w:pPr>
       <w:r>
-        <w:t xml:space="preserve">study book for first responders</w:t>
+        <w:t xml:space="preserve">scene safety and vital signs</w:t>
       </w:r>
     </w:p>
     <w:p>
@@ -6503,7 +6651,7 @@
         <w:pStyle w:val="Compact"/>
       </w:pPr>
       <w:r>
-        <w:t xml:space="preserve">emergency department clinical rotation</w:t>
+        <w:t xml:space="preserve">handover and documentation skills</w:t>
       </w:r>
     </w:p>
     <w:p>
@@ -6533,7 +6681,7 @@
           <w:bCs/>
           <w:b/>
         </w:rPr>
-        <w:t xml:space="preserve">primary survey and secondary survey</w:t>
+        <w:t xml:space="preserve">primary and secondary survey</w:t>
       </w:r>
     </w:p>
     <w:p>
@@ -6545,7 +6693,25 @@
         <w:pStyle w:val="Compact"/>
       </w:pPr>
       <w:r>
-        <w:t xml:space="preserve">Manuscript link: Entries 1.3 and 1.4 teach both surveys (primary survey appears 42 times in the text)</w:t>
+        <w:t xml:space="preserve">Manuscript link: Entries 1.3 and 1.4 teach both surveys (the phrase</w:t>
+      </w:r>
+      <w:r>
+        <w:t xml:space="preserve"> </w:t>
+      </w:r>
+      <w:r>
+        <w:t xml:space="preserve">‘</w:t>
+      </w:r>
+      <w:r>
+        <w:t xml:space="preserve">primary survey</w:t>
+      </w:r>
+      <w:r>
+        <w:t xml:space="preserve">’</w:t>
+      </w:r>
+      <w:r>
+        <w:t xml:space="preserve"> </w:t>
+      </w:r>
+      <w:r>
+        <w:t xml:space="preserve">appears 42 times in the chapters)</w:t>
       </w:r>
     </w:p>
     <w:p>
@@ -7037,7 +7203,7 @@
         <w:pStyle w:val="Compact"/>
       </w:pPr>
       <w:r>
-        <w:t xml:space="preserve">Manuscript link: Entry 4.2 has a tourniquet procedure (the word appears 29 times)</w:t>
+        <w:t xml:space="preserve">Manuscript link: Entry 4.2 has a tourniquet procedure (the word appears 31 times in the chapters)</w:t>
       </w:r>
     </w:p>
     <w:p>
@@ -7283,7 +7449,7 @@
           <w:bCs/>
           <w:b/>
         </w:rPr>
-        <w:t xml:space="preserve">study book for first responders</w:t>
+        <w:t xml:space="preserve">scene safety and vital signs</w:t>
       </w:r>
     </w:p>
     <w:p>
@@ -7295,7 +7461,7 @@
         <w:pStyle w:val="Compact"/>
       </w:pPr>
       <w:r>
-        <w:t xml:space="preserve">Manuscript link: Written for new responders and students</w:t>
+        <w:t xml:space="preserve">Manuscript link: Entries 1.1 (scene safety) and 1.4 (vital signs)</w:t>
       </w:r>
     </w:p>
     <w:p>
@@ -7307,7 +7473,7 @@
         <w:pStyle w:val="Compact"/>
       </w:pPr>
       <w:r>
-        <w:t xml:space="preserve">Target reader: EMT and paramedic students</w:t>
+        <w:t xml:space="preserve">Target reader: Student learning the first steps of any response</w:t>
       </w:r>
     </w:p>
     <w:p>
@@ -7319,7 +7485,7 @@
         <w:pStyle w:val="Compact"/>
       </w:pPr>
       <w:r>
-        <w:t xml:space="preserve">Likely intent: Find a study aid</w:t>
+        <w:t xml:space="preserve">Likely intent: Find a guide to the first checks</w:t>
       </w:r>
     </w:p>
     <w:p>
@@ -7331,70 +7497,7 @@
         <w:pStyle w:val="Compact"/>
       </w:pPr>
       <w:r>
-        <w:t xml:space="preserve">Autocomplete evidence: Seen:</w:t>
-      </w:r>
-      <w:r>
-        <w:t xml:space="preserve"> </w:t>
-      </w:r>
-      <w:r>
-        <w:t xml:space="preserve">‘</w:t>
-      </w:r>
-      <w:r>
-        <w:t xml:space="preserve">paramedic study book</w:t>
-      </w:r>
-      <w:r>
-        <w:t xml:space="preserve">’</w:t>
-      </w:r>
-      <w:r>
-        <w:t xml:space="preserve"> </w:t>
-      </w:r>
-      <w:r>
-        <w:t xml:space="preserve">appeared for the prefix</w:t>
-      </w:r>
-      <w:r>
-        <w:t xml:space="preserve"> </w:t>
-      </w:r>
-      <w:r>
-        <w:t xml:space="preserve">‘</w:t>
-      </w:r>
-      <w:r>
-        <w:t xml:space="preserve">paramedic study</w:t>
-      </w:r>
-      <w:r>
-        <w:t xml:space="preserve">’</w:t>
-      </w:r>
-      <w:r>
-        <w:t xml:space="preserve">;</w:t>
-      </w:r>
-      <w:r>
-        <w:t xml:space="preserve"> </w:t>
-      </w:r>
-      <w:r>
-        <w:t xml:space="preserve">‘</w:t>
-      </w:r>
-      <w:r>
-        <w:t xml:space="preserve">emt study coloring book</w:t>
-      </w:r>
-      <w:r>
-        <w:t xml:space="preserve">’</w:t>
-      </w:r>
-      <w:r>
-        <w:t xml:space="preserve"> </w:t>
-      </w:r>
-      <w:r>
-        <w:t xml:space="preserve">for</w:t>
-      </w:r>
-      <w:r>
-        <w:t xml:space="preserve"> </w:t>
-      </w:r>
-      <w:r>
-        <w:t xml:space="preserve">‘</w:t>
-      </w:r>
-      <w:r>
-        <w:t xml:space="preserve">emt study</w:t>
-      </w:r>
-      <w:r>
-        <w:t xml:space="preserve">’</w:t>
+        <w:t xml:space="preserve">Autocomplete evidence: Not seen</w:t>
       </w:r>
     </w:p>
     <w:p>
@@ -7406,7 +7509,7 @@
         <w:pStyle w:val="Compact"/>
       </w:pPr>
       <w:r>
-        <w:t xml:space="preserve">Search-result evidence: Autocomplete shows wording only, not volume</w:t>
+        <w:t xml:space="preserve">Search-result evidence: Not seen this session</w:t>
       </w:r>
     </w:p>
     <w:p>
@@ -7430,7 +7533,7 @@
         <w:pStyle w:val="Compact"/>
       </w:pPr>
       <w:r>
-        <w:t xml:space="preserve">Reason: Uses a phrase customers type</w:t>
+        <w:t xml:space="preserve">Reason: Two core topics, no title or subtitle words, no generic word</w:t>
       </w:r>
     </w:p>
     <w:p>
@@ -7442,43 +7545,7 @@
         <w:pStyle w:val="Compact"/>
       </w:pPr>
       <w:r>
-        <w:t xml:space="preserve">Weakness:</w:t>
-      </w:r>
-      <w:r>
-        <w:t xml:space="preserve"> </w:t>
-      </w:r>
-      <w:r>
-        <w:t xml:space="preserve">‘</w:t>
-      </w:r>
-      <w:r>
-        <w:t xml:space="preserve">first responders</w:t>
-      </w:r>
-      <w:r>
-        <w:t xml:space="preserve">’</w:t>
-      </w:r>
-      <w:r>
-        <w:t xml:space="preserve"> </w:t>
-      </w:r>
-      <w:r>
-        <w:t xml:space="preserve">is broader than the audience;</w:t>
-      </w:r>
-      <w:r>
-        <w:t xml:space="preserve"> </w:t>
-      </w:r>
-      <w:r>
-        <w:t xml:space="preserve">‘</w:t>
-      </w:r>
-      <w:r>
-        <w:t xml:space="preserve">coloring book</w:t>
-      </w:r>
-      <w:r>
-        <w:t xml:space="preserve">’</w:t>
-      </w:r>
-      <w:r>
-        <w:t xml:space="preserve"> </w:t>
-      </w:r>
-      <w:r>
-        <w:t xml:space="preserve">is an unrelated format</w:t>
+        <w:t xml:space="preserve">Weakness: No evidence of search demand; wording is descriptive, not proven</w:t>
       </w:r>
     </w:p>
     <w:p>
@@ -7490,7 +7557,7 @@
         <w:pStyle w:val="Compact"/>
       </w:pPr>
       <w:r>
-        <w:t xml:space="preserve">Confidence: Medium</w:t>
+        <w:t xml:space="preserve">Confidence: Low</w:t>
       </w:r>
     </w:p>
     <w:p>
@@ -7502,7 +7569,7 @@
           <w:bCs/>
           <w:b/>
         </w:rPr>
-        <w:t xml:space="preserve">emergency department clinical rotation</w:t>
+        <w:t xml:space="preserve">handover and documentation skills</w:t>
       </w:r>
     </w:p>
     <w:p>
@@ -7514,7 +7581,7 @@
         <w:pStyle w:val="Compact"/>
       </w:pPr>
       <w:r>
-        <w:t xml:space="preserve">Manuscript link: The book targets students in first emergency placements and courses (How to Use This Book)</w:t>
+        <w:t xml:space="preserve">Manuscript link: Entry 1.5 (communication, consent, scope of practice, handover, reassessment and documentation)</w:t>
       </w:r>
     </w:p>
     <w:p>
@@ -7526,7 +7593,7 @@
         <w:pStyle w:val="Compact"/>
       </w:pPr>
       <w:r>
-        <w:t xml:space="preserve">Target reader: Nursing and allied health students starting a clinical rotation</w:t>
+        <w:t xml:space="preserve">Target reader: Student learning to report a patient clearly</w:t>
       </w:r>
     </w:p>
     <w:p>
@@ -7538,7 +7605,7 @@
         <w:pStyle w:val="Compact"/>
       </w:pPr>
       <w:r>
-        <w:t xml:space="preserve">Likely intent: Find prep material before clinical work</w:t>
+        <w:t xml:space="preserve">Likely intent: Find help with handover and charting</w:t>
       </w:r>
     </w:p>
     <w:p>
@@ -7562,31 +7629,7 @@
         <w:pStyle w:val="Compact"/>
       </w:pPr>
       <w:r>
-        <w:t xml:space="preserve">Search-result evidence: Web search for emergency nursing quick-reference books for placements returned a title built for this need; US wording (</w:t>
-      </w:r>
-      <w:r>
-        <w:t xml:space="preserve">‘</w:t>
-      </w:r>
-      <w:r>
-        <w:t xml:space="preserve">clinical rotation</w:t>
-      </w:r>
-      <w:r>
-        <w:t xml:space="preserve">’</w:t>
-      </w:r>
-      <w:r>
-        <w:t xml:space="preserve">) chosen over UK</w:t>
-      </w:r>
-      <w:r>
-        <w:t xml:space="preserve"> </w:t>
-      </w:r>
-      <w:r>
-        <w:t xml:space="preserve">‘</w:t>
-      </w:r>
-      <w:r>
-        <w:t xml:space="preserve">placement</w:t>
-      </w:r>
-      <w:r>
-        <w:t xml:space="preserve">’</w:t>
+        <w:t xml:space="preserve">Search-result evidence: Not seen this session; the earlier Emergency Nursing bestseller list (market-research.md) included a charting guide</w:t>
       </w:r>
     </w:p>
     <w:p>
@@ -7598,7 +7641,7 @@
         <w:pStyle w:val="Compact"/>
       </w:pPr>
       <w:r>
-        <w:t xml:space="preserve">Bestseller or comparable evidence: Comparable title exists for placement use</w:t>
+        <w:t xml:space="preserve">Bestseller or comparable evidence: Charting guide seen in the Emergency Nursing top 7 on 2026-10-28</w:t>
       </w:r>
     </w:p>
     <w:p>
@@ -7610,7 +7653,7 @@
         <w:pStyle w:val="Compact"/>
       </w:pPr>
       <w:r>
-        <w:t xml:space="preserve">Reason: Names the real situation of the reader</w:t>
+        <w:t xml:space="preserve">Reason: Distinct topic, no title words, matches a real entry</w:t>
       </w:r>
     </w:p>
     <w:p>
@@ -7622,25 +7665,7 @@
         <w:pStyle w:val="Compact"/>
       </w:pPr>
       <w:r>
-        <w:t xml:space="preserve">Weakness: Longest phrase; no Amazon autocomplete or results evidence; overlaps</w:t>
-      </w:r>
-      <w:r>
-        <w:t xml:space="preserve"> </w:t>
-      </w:r>
-      <w:r>
-        <w:t xml:space="preserve">‘</w:t>
-      </w:r>
-      <w:r>
-        <w:t xml:space="preserve">emergency</w:t>
-      </w:r>
-      <w:r>
-        <w:t xml:space="preserve">’</w:t>
-      </w:r>
-      <w:r>
-        <w:t xml:space="preserve"> </w:t>
-      </w:r>
-      <w:r>
-        <w:t xml:space="preserve">in the title</w:t>
+        <w:t xml:space="preserve">Weakness: Could attract general charting shoppers</w:t>
       </w:r>
     </w:p>
     <w:p>
@@ -8247,7 +8272,7 @@
               <w:jc w:val="left"/>
             </w:pPr>
             <w:r>
-              <w:t xml:space="preserve">Exactly seven keywords, none repeating title words as a single word list, no program names, no generic</w:t>
+              <w:t xml:space="preserve">Exactly seven keywords; none uses the generic word</w:t>
             </w:r>
             <w:r>
               <w:t xml:space="preserve"> </w:t>
@@ -8261,17 +8286,59 @@
             <w:r>
               <w:t xml:space="preserve">’</w:t>
             </w:r>
-          </w:p>
-        </w:tc>
-        <w:tc>
-          <w:tcPr/>
-          <w:p>
-            <w:pPr>
-              <w:pStyle w:val="Compact"/>
-              <w:jc w:val="left"/>
-            </w:pPr>
-            <w:r>
-              <w:t xml:space="preserve">PASS</w:t>
+            <w:r>
+              <w:t xml:space="preserve"> </w:t>
+            </w:r>
+            <w:r>
+              <w:t xml:space="preserve">or a program name;</w:t>
+            </w:r>
+            <w:r>
+              <w:t xml:space="preserve"> </w:t>
+            </w:r>
+            <w:r>
+              <w:t xml:space="preserve">‘</w:t>
+            </w:r>
+            <w:r>
+              <w:t xml:space="preserve">survey</w:t>
+            </w:r>
+            <w:r>
+              <w:t xml:space="preserve">’</w:t>
+            </w:r>
+            <w:r>
+              <w:t xml:space="preserve"> </w:t>
+            </w:r>
+            <w:r>
+              <w:t xml:space="preserve">and</w:t>
+            </w:r>
+            <w:r>
+              <w:t xml:space="preserve"> </w:t>
+            </w:r>
+            <w:r>
+              <w:t xml:space="preserve">‘</w:t>
+            </w:r>
+            <w:r>
+              <w:t xml:space="preserve">assessment</w:t>
+            </w:r>
+            <w:r>
+              <w:t xml:space="preserve">’</w:t>
+            </w:r>
+            <w:r>
+              <w:t xml:space="preserve"> </w:t>
+            </w:r>
+            <w:r>
+              <w:t xml:space="preserve">wording checked against the title and subtitle</w:t>
+            </w:r>
+          </w:p>
+        </w:tc>
+        <w:tc>
+          <w:tcPr/>
+          <w:p>
+            <w:pPr>
+              <w:pStyle w:val="Compact"/>
+              <w:jc w:val="left"/>
+            </w:pPr>
+            <w:r>
+              <w:t xml:space="preserve">PASS after review</w:t>
             </w:r>
           </w:p>
         </w:tc>
@@ -8311,19 +8378,19 @@
               <w:jc w:val="left"/>
             </w:pPr>
             <w:r>
-              <w:t xml:space="preserve">Claims match the manuscript (45 entries, 25 figures, 68 glossary terms, 179 pages, no medicine doses)</w:t>
-            </w:r>
-          </w:p>
-        </w:tc>
-        <w:tc>
-          <w:tcPr/>
-          <w:p>
-            <w:pPr>
-              <w:pStyle w:val="Compact"/>
-              <w:jc w:val="left"/>
-            </w:pPr>
-            <w:r>
-              <w:t xml:space="preserve">PASS, counted from the files</w:t>
+              <w:t xml:space="preserve">Claims match the manuscript (33 entries, 25 figures, 68 glossary terms, 179 pages, no medicine doses)</w:t>
+            </w:r>
+          </w:p>
+        </w:tc>
+        <w:tc>
+          <w:tcPr/>
+          <w:p>
+            <w:pPr>
+              <w:pStyle w:val="Compact"/>
+              <w:jc w:val="left"/>
+            </w:pPr>
+            <w:r>
+              <w:t xml:space="preserve">PASS, recounted from the files after review (33 entries, not 45)</w:t>
             </w:r>
           </w:p>
         </w:tc>
@@ -8349,7 +8416,7 @@
               <w:jc w:val="left"/>
             </w:pPr>
             <w:r>
-              <w:t xml:space="preserve">See section 22</w:t>
+              <w:t xml:space="preserve">Done 2026-10-29: REVISE, 13 findings; items 1 to 9 and 13 fixed here (compliance/kdp-metadata.md). Items 10 (categories) and 11 (cover match) stay open until the owner chooses categories and the cover exists. Item 12: clinician clearance is recorded on the owner’s word only, and no clinician-reviewed wording is used</w:t>
             </w:r>
           </w:p>
         </w:tc>
@@ -8422,7 +8489,7 @@
         <w:pStyle w:val="Compact"/>
       </w:pPr>
       <w:r>
-        <w:t xml:space="preserve">The page counts and figures in the descriptions were counted from the files on 2026-10-29. Update them if the book changes.</w:t>
+        <w:t xml:space="preserve">The page counts and figures in the descriptions were counted from the files on 2026-10-29 (33 numbered entries, 25 figures, 68 glossary terms, 179 pages). Update them if the book changes.</w:t>
       </w:r>
     </w:p>
     <w:p>

</xml_diff>

<commit_message>
Apply second compliance review fixes; rebuild final PDF
Co-Authored-By: Claude Sonnet 5.5 <noreply@anthropic.com>
Claude-Session: https://claude.ai/code/session_0168JnD9FtTqg34DkRs7Q2We
</commit_message>
<xml_diff>
--- a/books/emergency-medicine/final/KDP-metadata.docx
+++ b/books/emergency-medicine/final/KDP-metadata.docx
@@ -516,7 +516,7 @@
         <w:t xml:space="preserve"> </w:t>
       </w:r>
       <w:r>
-        <w:t xml:space="preserve">142 characters (KDP limit: fewer than 200).</w:t>
+        <w:t xml:space="preserve">159 characters (KDP limit: fewer than 200).</w:t>
       </w:r>
     </w:p>
     <w:bookmarkEnd w:id="21"/>
@@ -1667,7 +1667,7 @@
         <w:pStyle w:val="BodyText"/>
       </w:pPr>
       <w:r>
-        <w:t xml:space="preserve">What you may do depends on your license, certification, course and the rules of your service or school. Scope Note boxes mark the limits of your role, and procedures tell you when to stop and when to call for more help. Practical advice is paired with plain statements of what the book does not cover, such as medicine amounts, intravenous access, detailed heart tracing interpretation and advanced airway skills, so you always know where this guide ends and your training begins.</w:t>
+        <w:t xml:space="preserve">What you may do depends on your license, certification, course and the rules of your service or school. Scope Note boxes mark the limits of your role, and procedures tell you when to stop and when to call for more help. Practical advice is paired with plain statements of what the book does not cover, such as medicine amounts, intravenous access, full heart tracing (ECG) interpretation and advanced airway skills, so you always know where this guide ends and your training begins.</w:t>
       </w:r>
     </w:p>
     <w:p>
@@ -2294,7 +2294,7 @@
         <w:rPr>
           <w:rStyle w:val="NormalTok"/>
         </w:rPr>
-        <w:t xml:space="preserve">What you may do depends on your license, certification, course and the rules of your service or school. Scope Note boxes mark the limits of your role, and procedures tell you when to stop and when to call for more help. Practical advice is paired with plain statements of what the book does not cover, such as medicine amounts, intravenous access, detailed heart tracing interpretation and advanced airway skills, so you always know where this guide ends and your training begins.</w:t>
+        <w:t xml:space="preserve">What you may do depends on your license, certification, course and the rules of your service or school. Scope Note boxes mark the limits of your role, and procedures tell you when to stop and when to call for more help. Practical advice is paired with plain statements of what the book does not cover, such as medicine amounts, intravenous access, full heart tracing (ECG) interpretation and advanced airway skills, so you always know where this guide ends and your training begins.</w:t>
       </w:r>
       <w:r>
         <w:rPr>
@@ -4416,7 +4416,7 @@
         <w:pStyle w:val="BodyText"/>
       </w:pPr>
       <w:r>
-        <w:t xml:space="preserve">Scope Note boxes mark the limits of your role, and procedures tell you when to stop and when to call for more help. The book also says plainly what it leaves out, such as medicine amounts, intravenous access, detailed heart tracing interpretation and advanced airway skills, so you always know where the guide ends and your training begins.</w:t>
+        <w:t xml:space="preserve">Scope Note boxes mark the limits of your role, and procedures tell you when to stop and when to call for more help. The book also says plainly what it leaves out, such as medicine amounts, intravenous access, full heart tracing (ECG) interpretation and advanced airway skills, so you always know where the guide ends and your training begins.</w:t>
       </w:r>
     </w:p>
     <w:p>
@@ -5107,7 +5107,7 @@
         <w:rPr>
           <w:rStyle w:val="NormalTok"/>
         </w:rPr>
-        <w:t xml:space="preserve">Scope Note boxes mark the limits of your role, and procedures tell you when to stop and when to call for more help. The book also says plainly what it leaves out, such as medicine amounts, intravenous access, detailed heart tracing interpretation and advanced airway skills, so you always know where the guide ends and your training begins.</w:t>
+        <w:t xml:space="preserve">Scope Note boxes mark the limits of your role, and procedures tell you when to stop and when to call for more help. The book also says plainly what it leaves out, such as medicine amounts, intravenous access, full heart tracing (ECG) interpretation and advanced airway skills, so you always know where the guide ends and your training begins.</w:t>
       </w:r>
       <w:r>
         <w:rPr>
@@ -5906,7 +5906,7 @@
               <w:jc w:val="left"/>
             </w:pPr>
             <w:r>
-              <w:t xml:space="preserve">Rejected: Entry 1.3 teaches the ABCDE order, but the string appears only once in the text, no autocomplete evidence, and the letters read as an abbreviation not a search phrase</w:t>
+              <w:t xml:space="preserve">Rejected: Entry 1.3 teaches the ABCDE order, but the string appears only twice in the text (Entry 1.3 calls it the spine of the whole book), no autocomplete evidence, and the letters read as an abbreviation not a search phrase</w:t>
             </w:r>
           </w:p>
         </w:tc>
@@ -8416,7 +8416,7 @@
               <w:jc w:val="left"/>
             </w:pPr>
             <w:r>
-              <w:t xml:space="preserve">Done 2026-10-29: REVISE, 13 findings; items 1 to 9 and 13 fixed here (compliance/kdp-metadata.md). Items 10 (categories) and 11 (cover match) stay open until the owner chooses categories and the cover exists. Item 12: clinician clearance is recorded on the owner’s word only, and no clinician-reviewed wording is used</w:t>
+              <w:t xml:space="preserve">Round 1 (2026-10-29, REVISE): wrong entry count, stranded headings, unsupported and absolute wording, three weak keywords, evidence counts, one topic-noun paragraph; all fixed. Round 2 (2026-10-30, REVISE): title length figure, ABCDE evidence row, heart-tracing wording; fixed. Still open: category check against the keywords and cover match (title, subtitle, author name), which need the owner. Clinician clearance is on the owner’s word only, and no clinician-reviewed wording is used</w:t>
             </w:r>
           </w:p>
         </w:tc>
@@ -8438,7 +8438,17 @@
           <w:ilvl w:val="0"/>
           <w:numId w:val="1016"/>
         </w:numPr>
-        <w:pStyle w:val="Compact"/>
+      </w:pPr>
+      <w:r>
+        <w:t xml:space="preserve">Upload only the final description in section 16. Descriptions Two and Three contain topic-noun lists and are for comparison only.</w:t>
+      </w:r>
+    </w:p>
+    <w:p>
+      <w:pPr>
+        <w:numPr>
+          <w:ilvl w:val="0"/>
+          <w:numId w:val="1016"/>
+        </w:numPr>
       </w:pPr>
       <w:r>
         <w:t xml:space="preserve">No browser was available. Amazon results pages returned HTTP 503. I did not open any Amazon results page, bestseller list or product page this session.</w:t>
@@ -8450,7 +8460,6 @@
           <w:ilvl w:val="0"/>
           <w:numId w:val="1016"/>
         </w:numPr>
-        <w:pStyle w:val="Compact"/>
       </w:pPr>
       <w:r>
         <w:t xml:space="preserve">Autocomplete came from Amazon’s suggestion service, not from typing in the search box, and it returned few suggestions. Autocomplete shows wording only, not volume, competition or buyer intent.</w:t>
@@ -8462,7 +8471,6 @@
           <w:ilvl w:val="0"/>
           <w:numId w:val="1016"/>
         </w:numPr>
-        <w:pStyle w:val="Compact"/>
       </w:pPr>
       <w:r>
         <w:t xml:space="preserve">Keyword evidence is therefore weaker than the framework asks for; confidence is Medium or Low for every phrase.</w:t>
@@ -8474,7 +8482,6 @@
           <w:ilvl w:val="0"/>
           <w:numId w:val="1016"/>
         </w:numPr>
-        <w:pStyle w:val="Compact"/>
       </w:pPr>
       <w:r>
         <w:t xml:space="preserve">The KDP keyword help page gives no per-field character limit; third-party sources say 50. Check the KDP field counter.</w:t>
@@ -8486,7 +8493,6 @@
           <w:ilvl w:val="0"/>
           <w:numId w:val="1016"/>
         </w:numPr>
-        <w:pStyle w:val="Compact"/>
       </w:pPr>
       <w:r>
         <w:t xml:space="preserve">The page counts and figures in the descriptions were counted from the files on 2026-10-29 (33 numbered entries, 25 figures, 68 glossary terms, 179 pages). Update them if the book changes.</w:t>
@@ -8498,7 +8504,6 @@
           <w:ilvl w:val="0"/>
           <w:numId w:val="1016"/>
         </w:numPr>
-        <w:pStyle w:val="Compact"/>
       </w:pPr>
       <w:r>
         <w:t xml:space="preserve">If you can open Amazon in your own browser, type each of the seven phrases and see whether the results are relevant books; replace any phrase that returns unrelated products.</w:t>

</xml_diff>